<commit_message>
Account Created! pop-up after sign-up; Discover lists titles A-Z
- After creating an account, a non-dismissible "Account Created!" dialog
  offers "Proceed to CineMatch" (signs in) or "Back to sign in" (sign-in
  tab with the new username filled in); the sign-up form is cleared
- Discover's poster wall is sorted A-Z (Home and Recommended already show
  what is popular); searches put titles that start with the query first
- README, Documentation and Details updated

Co-Authored-By: Claude Opus 5.5 <noreply@anthropic.com>
</commit_message>
<xml_diff>
--- a/Details_updated.docx
+++ b/Details_updated.docx
@@ -3957,7 +3957,7 @@
               <w:keepNext/>
             </w:pPr>
             <w:r>
-              <w:t>Every visitor signs in; new accounts are always users. Passwords are stored hashed.</w:t>
+              <w:t>Every visitor signs in; new accounts are always users and passwords are stored hashed. After signing up, an “Account Created!” pop-up offers Proceed to CineMatch (signs straight in) or Back to sign in (the sign-in tab, with the new username filled in).</w:t>
             </w:r>
           </w:p>
         </w:tc>
@@ -4067,7 +4067,7 @@
               <w:keepNext/>
             </w:pPr>
             <w:r>
-              <w:t>Search a title with live suggestions, filter by genre, minimum rating and decade, browse a paged poster wall (15 per page), or press Surprise me. Searches, the genre filter and Find movies like this are recorded as signals.</w:t>
+              <w:t>Search a title with live suggestions, filter by genre, minimum rating and decade, browse a paged poster wall (15 per page) sorted A–Z — Home and Recommended already show what is popular, and a search puts titles that start with it first, or press Surprise me. Searches, the genre filter and Find movies like this are recorded as signals.</w:t>
             </w:r>
           </w:p>
         </w:tc>

</xml_diff>